<commit_message>
24108030117 update final report leakage and validation
</commit_message>
<xml_diff>
--- a/时间序列预测作业报告.docx
+++ b/时间序列预测作业报告.docx
@@ -60,7 +60,7 @@
           <w:szCs w:val="18"/>
           <w:lang w:val="en-US" w:eastAsia="zh-CN"/>
         </w:rPr>
-        <w:t>何惟几；学号：24108030117；提交日期：2026.10.13；代码仓库地址：</w:t>
+        <w:t>何惟几；学号：24108030117；提交日期：2026.10.13；代码仓库地址：https://github.com/Vicky311-H/ts-forecast-24108030117</w:t>
       </w:r>
     </w:p>
     <w:p>
@@ -2922,8 +2922,6 @@
                 <w:lang w:val="en-US" w:eastAsia="zh-CN"/>
               </w:rPr>
             </w:pPr>
-            <w:bookmarkStart w:id="0" w:name="_GoBack"/>
-            <w:bookmarkEnd w:id="0"/>
             <w:r>
               <w:rPr>
                 <w:rFonts w:hint="eastAsia" w:ascii="Times New Roman" w:hAnsi="Times New Roman" w:eastAsia="宋体" w:cs="Times New Roman"/>
@@ -4398,6 +4396,12 @@
             <w:insideH w:val="single" w:color="auto" w:sz="4" w:space="0"/>
             <w:insideV w:val="single" w:color="auto" w:sz="4" w:space="0"/>
           </w:tblBorders>
+          <w:tblCellMar>
+            <w:top w:w="0" w:type="dxa"/>
+            <w:left w:w="108" w:type="dxa"/>
+            <w:bottom w:w="0" w:type="dxa"/>
+            <w:right w:w="108" w:type="dxa"/>
+          </w:tblCellMar>
         </w:tblPrEx>
         <w:tc>
           <w:tcPr>
@@ -8347,6 +8351,14 @@
         <w:gridCol w:w="4897"/>
       </w:tblGrid>
       <w:tr>
+        <w:tblPrEx>
+          <w:tblCellMar>
+            <w:top w:w="0" w:type="dxa"/>
+            <w:left w:w="108" w:type="dxa"/>
+            <w:bottom w:w="0" w:type="dxa"/>
+            <w:right w:w="108" w:type="dxa"/>
+          </w:tblCellMar>
+        </w:tblPrEx>
         <w:tc>
           <w:tcPr>
             <w:tcW w:w="1700" w:type="pct"/>
@@ -10346,12 +10358,12 @@
       </w:pPr>
       <w:r>
         <w:rPr>
-          <w:rFonts w:hint="default" w:ascii="Times New Roman" w:hAnsi="Times New Roman" w:eastAsia="宋体" w:cs="Times New Roman"/>
+          <w:rFonts w:hint="eastAsia" w:ascii="Times New Roman" w:hAnsi="Times New Roman" w:eastAsia="宋体" w:cs="Times New Roman"/>
           <w:sz w:val="18"/>
           <w:szCs w:val="18"/>
           <w:lang w:eastAsia="zh-CN"/>
         </w:rPr>
-        <w:t>☑</w:t>
+        <w:t>□</w:t>
       </w:r>
       <w:r>
         <w:rPr>
@@ -10506,14 +10518,16 @@
           <w:szCs w:val="18"/>
         </w:rPr>
       </w:pPr>
+      <w:bookmarkStart w:id="0" w:name="_GoBack"/>
+      <w:bookmarkEnd w:id="0"/>
       <w:r>
         <w:rPr>
-          <w:rFonts w:hint="default" w:ascii="Times New Roman" w:hAnsi="Times New Roman" w:eastAsia="宋体" w:cs="Times New Roman"/>
+          <w:rFonts w:hint="eastAsia" w:ascii="Times New Roman" w:hAnsi="Times New Roman" w:eastAsia="宋体" w:cs="Times New Roman"/>
           <w:sz w:val="18"/>
           <w:szCs w:val="18"/>
           <w:lang w:eastAsia="zh-CN"/>
         </w:rPr>
-        <w:t>☑</w:t>
+        <w:t>□</w:t>
       </w:r>
       <w:r>
         <w:rPr>
@@ -10664,7 +10678,7 @@
     <w:lsdException w:unhideWhenUsed="0" w:uiPriority="0" w:semiHidden="0" w:name="macro"/>
     <w:lsdException w:unhideWhenUsed="0" w:uiPriority="0" w:semiHidden="0" w:name="toa heading"/>
     <w:lsdException w:unhideWhenUsed="0" w:uiPriority="0" w:semiHidden="0" w:name="List"/>
-    <w:lsdException w:unhideWhenUsed="0" w:uiPriority="0" w:semiHidden="0" w:name="List Bullet"/>
+    <w:lsdException w:qFormat="1" w:unhideWhenUsed="0" w:uiPriority="0" w:semiHidden="0" w:name="List Bullet"/>
     <w:lsdException w:unhideWhenUsed="0" w:uiPriority="0" w:semiHidden="0" w:name="List Number"/>
     <w:lsdException w:unhideWhenUsed="0" w:uiPriority="0" w:semiHidden="0" w:name="List 2"/>
     <w:lsdException w:unhideWhenUsed="0" w:uiPriority="0" w:semiHidden="0" w:name="List 3"/>
@@ -10719,7 +10733,7 @@
     <w:lsdException w:unhideWhenUsed="0" w:uiPriority="0" w:semiHidden="0" w:name="HTML Sample"/>
     <w:lsdException w:unhideWhenUsed="0" w:uiPriority="0" w:semiHidden="0" w:name="HTML Typewriter"/>
     <w:lsdException w:unhideWhenUsed="0" w:uiPriority="0" w:semiHidden="0" w:name="HTML Variable"/>
-    <w:lsdException w:unhideWhenUsed="0" w:uiPriority="0" w:name="Normal Table"/>
+    <w:lsdException w:qFormat="1" w:unhideWhenUsed="0" w:uiPriority="0" w:name="Normal Table"/>
     <w:lsdException w:unhideWhenUsed="0" w:uiPriority="0" w:semiHidden="0" w:name="annotation subject"/>
     <w:lsdException w:unhideWhenUsed="0" w:uiPriority="0" w:semiHidden="0" w:name="Table Simple 1"/>
     <w:lsdException w:unhideWhenUsed="0" w:uiPriority="0" w:semiHidden="0" w:name="Table Simple 2"/>
@@ -10932,6 +10946,7 @@
   <w:style w:type="table" w:default="1" w:styleId="6">
     <w:name w:val="Normal Table"/>
     <w:semiHidden/>
+    <w:qFormat/>
     <w:uiPriority w:val="0"/>
     <w:tblPr>
       <w:tblCellMar>
@@ -10945,6 +10960,7 @@
   <w:style w:type="paragraph" w:styleId="4">
     <w:name w:val="List Bullet"/>
     <w:basedOn w:val="1"/>
+    <w:qFormat/>
     <w:uiPriority w:val="0"/>
     <w:pPr>
       <w:numPr>

</xml_diff>

<commit_message>
24108030117 finalize report Ridge_holdout_MASE=0.544148
</commit_message>
<xml_diff>
--- a/时间序列预测作业报告.docx
+++ b/时间序列预测作业报告.docx
@@ -3205,6 +3205,12 @@
             <w:insideH w:val="single" w:color="auto" w:sz="4" w:space="0"/>
             <w:insideV w:val="single" w:color="auto" w:sz="4" w:space="0"/>
           </w:tblBorders>
+          <w:tblCellMar>
+            <w:top w:w="0" w:type="dxa"/>
+            <w:left w:w="108" w:type="dxa"/>
+            <w:bottom w:w="0" w:type="dxa"/>
+            <w:right w:w="108" w:type="dxa"/>
+          </w:tblCellMar>
         </w:tblPrEx>
         <w:tc>
           <w:tcPr>
@@ -4943,11 +4949,28 @@
         <w:jc w:val="both"/>
         <w:rPr>
           <w:rFonts w:hint="default" w:ascii="Times New Roman" w:hAnsi="Times New Roman" w:eastAsia="宋体" w:cs="Times New Roman"/>
+          <w:b/>
+          <w:color w:val="auto"/>
+          <w:kern w:val="2"/>
+          <w:sz w:val="18"/>
+          <w:szCs w:val="18"/>
+          <w:lang w:val="en-US" w:eastAsia="zh-CN" w:bidi="ar-SA"/>
+        </w:rPr>
+      </w:pPr>
+    </w:p>
+    <w:p>
+      <w:pPr>
+        <w:widowControl w:val="0"/>
+        <w:jc w:val="both"/>
+        <w:rPr>
+          <w:rFonts w:hint="default" w:ascii="Times New Roman" w:hAnsi="Times New Roman" w:eastAsia="宋体" w:cs="Times New Roman"/>
           <w:b w:val="0"/>
           <w:sz w:val="18"/>
           <w:szCs w:val="18"/>
         </w:rPr>
       </w:pPr>
+      <w:bookmarkStart w:id="0" w:name="_GoBack"/>
+      <w:bookmarkEnd w:id="0"/>
       <w:r>
         <w:rPr>
           <w:rFonts w:hint="default" w:ascii="Times New Roman" w:hAnsi="Times New Roman" w:eastAsia="宋体" w:cs="Times New Roman"/>
@@ -6744,6 +6767,12 @@
             <w:insideH w:val="single" w:color="auto" w:sz="4" w:space="0"/>
             <w:insideV w:val="single" w:color="auto" w:sz="4" w:space="0"/>
           </w:tblBorders>
+          <w:tblCellMar>
+            <w:top w:w="0" w:type="dxa"/>
+            <w:left w:w="108" w:type="dxa"/>
+            <w:bottom w:w="0" w:type="dxa"/>
+            <w:right w:w="108" w:type="dxa"/>
+          </w:tblCellMar>
         </w:tblPrEx>
         <w:tc>
           <w:tcPr>
@@ -10351,7 +10380,7 @@
           <w:szCs w:val="18"/>
           <w:lang w:eastAsia="zh-CN"/>
         </w:rPr>
-        <w:t>□</w:t>
+        <w:t>☑</w:t>
       </w:r>
       <w:r>
         <w:rPr>
@@ -10506,8 +10535,6 @@
           <w:szCs w:val="18"/>
         </w:rPr>
       </w:pPr>
-      <w:bookmarkStart w:id="0" w:name="_GoBack"/>
-      <w:bookmarkEnd w:id="0"/>
       <w:r>
         <w:rPr>
           <w:rFonts w:hint="eastAsia" w:ascii="Times New Roman" w:hAnsi="Times New Roman" w:eastAsia="宋体" w:cs="Times New Roman"/>

</xml_diff>